<commit_message>
Quita la mención al QR (no era un código real) del PDF de Género y añade botón de suscripción a YouTube en Vídeos
El "[ QR ]" del PDF de Género era solo texto de marcador, no una imagen escaneable — se elimina esa mención y se deja únicamente el enlace en texto, tal y como pidió Mercedes.

El banner "Suscríbete hoy" al final de la página de Vídeos no tenía ningún botón para hacerlo; se añade un botón que enlaza al canal de YouTube.

Co-Authored-By: Claude Sonnet 5 <noreply@anthropic.com>
</commit_message>
<xml_diff>
--- a/DESCARGABLES_PDF/GÉNERO/EL GÉNERO EN ESPAÑOL.docx
+++ b/DESCARGABLES_PDF/GÉNERO/EL GÉNERO EN ESPAÑOL.docx
@@ -937,7 +937,6 @@
                 <w:sz w:val="48"/>
                 <w:szCs w:val="48"/>
               </w:rPr>
-              <w:t xml:space="preserve">[ </w:t>
             </w:r>
             <w:proofErr w:type="gramStart"/>
             <w:r>
@@ -947,7 +946,6 @@
                 <w:sz w:val="48"/>
                 <w:szCs w:val="48"/>
               </w:rPr>
-              <w:t>QR ]</w:t>
             </w:r>
             <w:proofErr w:type="gramEnd"/>
           </w:p>
@@ -980,7 +978,6 @@
                 <w:sz w:val="18"/>
                 <w:szCs w:val="18"/>
               </w:rPr>
-              <w:t>Escanea el QR</w:t>
             </w:r>
           </w:p>
           <w:p>
@@ -13386,7 +13383,6 @@
                 <w:sz w:val="40"/>
                 <w:szCs w:val="40"/>
               </w:rPr>
-              <w:t xml:space="preserve">[ </w:t>
             </w:r>
             <w:proofErr w:type="gramStart"/>
             <w:r>
@@ -13396,7 +13392,6 @@
                 <w:sz w:val="40"/>
                 <w:szCs w:val="40"/>
               </w:rPr>
-              <w:t>QR ]</w:t>
             </w:r>
             <w:proofErr w:type="gramEnd"/>
           </w:p>
@@ -13461,7 +13456,7 @@
                 <w:sz w:val="19"/>
                 <w:szCs w:val="19"/>
               </w:rPr>
-              <w:t>Escanea el QR o accede directamente desde tu dispositivo:</w:t>
+              <w:t>Accede directamente desde tu dispositivo:</w:t>
             </w:r>
           </w:p>
           <w:p>

</xml_diff>